<commit_message>
mf support for 04
</commit_message>
<xml_diff>
--- a/scripts/04_add_footnotes/template-draft.docx
+++ b/scripts/04_add_footnotes/template-draft.docx
@@ -10,27 +10,14 @@
       <w:r>
         <w:t xml:space="preserve">Table </w:t>
       </w:r>
-      <w:r>
-        <w:fldChar w:fldCharType="begin"/>
-      </w:r>
-      <w:r>
-        <w:instrText xml:space="preserve"> SEQ Table \* ARABIC </w:instrText>
-      </w:r>
-      <w:r>
-        <w:fldChar w:fldCharType="separate"/>
-      </w:r>
-      <w:r>
-        <w:rPr>
-          <w:noProof/>
-        </w:rPr>
-        <w:t>1</w:t>
-      </w:r>
-      <w:r>
-        <w:rPr>
-          <w:noProof/>
-        </w:rPr>
-        <w:fldChar w:fldCharType="end"/>
-      </w:r>
+      <w:fldSimple w:instr=" SEQ Table \* ARABIC ">
+        <w:r>
+          <w:rPr>
+            <w:noProof/>
+          </w:rPr>
+          <w:t>1</w:t>
+        </w:r>
+      </w:fldSimple>
       <w:r>
         <w:t>: Pharmacokinetic Parameters of Theophylline</w:t>
       </w:r>
@@ -2812,27 +2799,14 @@
       <w:r>
         <w:t xml:space="preserve">Figure </w:t>
       </w:r>
-      <w:r>
-        <w:fldChar w:fldCharType="begin"/>
-      </w:r>
-      <w:r>
-        <w:instrText xml:space="preserve"> SEQ Figure \* ARABIC </w:instrText>
-      </w:r>
-      <w:r>
-        <w:fldChar w:fldCharType="separate"/>
-      </w:r>
-      <w:r>
-        <w:rPr>
-          <w:noProof/>
-        </w:rPr>
-        <w:t>1</w:t>
-      </w:r>
-      <w:r>
-        <w:rPr>
-          <w:noProof/>
-        </w:rPr>
-        <w:fldChar w:fldCharType="end"/>
-      </w:r>
+      <w:fldSimple w:instr=" SEQ Figure \* ARABIC ">
+        <w:r>
+          <w:rPr>
+            <w:noProof/>
+          </w:rPr>
+          <w:t>1</w:t>
+        </w:r>
+      </w:fldSimple>
       <w:r>
         <w:t>: Linear Regression of AUC and Subject Weight</w:t>
       </w:r>
@@ -2923,6 +2897,158 @@
         <w:t xml:space="preserve">Abbreviations: AUC: area under the curve. WTBL: baseline weight. </w:t>
       </w:r>
       <w:bookmarkEnd w:id="4"/>
+    </w:p>
+    <w:p/>
+    <w:p>
+      <w:pPr>
+        <w:pStyle w:val="Caption"/>
+        <w:keepNext/>
+      </w:pPr>
+      <w:r>
+        <w:lastRenderedPageBreak/>
+        <w:t xml:space="preserve">Figure </w:t>
+      </w:r>
+      <w:r>
+        <w:fldChar w:fldCharType="begin"/>
+      </w:r>
+      <w:r>
+        <w:instrText xml:space="preserve"> SEQ Figure \* ARABIC </w:instrText>
+      </w:r>
+      <w:r>
+        <w:fldChar w:fldCharType="separate"/>
+      </w:r>
+      <w:r>
+        <w:rPr>
+          <w:noProof/>
+        </w:rPr>
+        <w:t>2</w:t>
+      </w:r>
+      <w:r>
+        <w:rPr>
+          <w:noProof/>
+        </w:rPr>
+        <w:fldChar w:fldCharType="end"/>
+      </w:r>
+      <w:r>
+        <w:t xml:space="preserve">: </w:t>
+      </w:r>
+      <w:r>
+        <w:t>Observed Theophylline Concentration–Time Profiles</w:t>
+      </w:r>
+    </w:p>
+    <w:p>
+      <w:pPr>
+        <w:keepNext/>
+      </w:pPr>
+      <w:r>
+        <w:t>{rpfy}:theoph-pk-conc.png</w:t>
+      </w:r>
+    </w:p>
+    <w:p>
+      <w:pPr>
+        <w:jc w:val="center"/>
+      </w:pPr>
+      <w:r>
+        <w:rPr>
+          <w:noProof/>
+        </w:rPr>
+        <w:drawing>
+          <wp:inline distT="0" distB="0" distL="0" distR="0" wp14:anchorId="2AA9F207" wp14:editId="54B6CC1C">
+            <wp:extent cx="5486400" cy="3657600"/>
+            <wp:effectExtent l="0" t="0" r="0" b="0"/>
+            <wp:docPr id="1258727019" name="Picture 1258727019" descr="{rpfy}:theoph-pk-conc.png"/>
+            <wp:cNvGraphicFramePr>
+              <a:graphicFrameLocks xmlns:a="http://schemas.openxmlformats.org/drawingml/2006/main" noChangeAspect="1"/>
+            </wp:cNvGraphicFramePr>
+            <a:graphic xmlns:a="http://schemas.openxmlformats.org/drawingml/2006/main">
+              <a:graphicData uri="http://schemas.openxmlformats.org/drawingml/2006/picture">
+                <pic:pic xmlns:pic="http://schemas.openxmlformats.org/drawingml/2006/picture">
+                  <pic:nvPicPr>
+                    <pic:cNvPr id="0" name="theoph-pk-conc.png"/>
+                    <pic:cNvPicPr/>
+                  </pic:nvPicPr>
+                  <pic:blipFill>
+                    <a:blip r:embed="rId6"/>
+                    <a:stretch>
+                      <a:fillRect/>
+                    </a:stretch>
+                  </pic:blipFill>
+                  <pic:spPr>
+                    <a:xfrm>
+                      <a:off x="0" y="0"/>
+                      <a:ext cx="5486400" cy="3657600"/>
+                    </a:xfrm>
+                    <a:prstGeom prst="rect">
+                      <a:avLst/>
+                    </a:prstGeom>
+                  </pic:spPr>
+                </pic:pic>
+              </a:graphicData>
+            </a:graphic>
+          </wp:inline>
+        </w:drawing>
+      </w:r>
+    </w:p>
+    <w:p>
+      <w:bookmarkStart w:id="8" w:name="fp_theoph-pk-conc.png"/>
+      <w:r>
+        <w:rPr>
+          <w:rFonts w:ascii="Arial Narrow"/>
+          <w:sz w:val="20"/>
+        </w:rPr>
+        <w:t>[Source: scripts/01_analysis/analysis.R 2025-04-30 16:27:12]</w:t>
+      </w:r>
+      <w:r>
+        <w:br/>
+      </w:r>
+      <w:r>
+        <w:rPr>
+          <w:rFonts w:ascii="Arial Narrow"/>
+          <w:sz w:val="20"/>
+        </w:rPr>
+        <w:t xml:space="preserve">Notes: This plot shows individual concentration-time trajectories for subjects in the study. The x-axis represents time (hours) and the y-axis shows drug concentration (ng/mL). Each line corresponds to a subject's concentration profile, illustrating variability in pharmacokinetics across the population. Key points like peak concentration (Cmax) and time to peak (Tmax) can be identified visually. No aggregation or smoothing has been applied, preserving the raw individual data. Each colored line represents the observed concentration–time profile for a specific subject identifier. </w:t>
+      </w:r>
+      <w:r>
+        <w:br/>
+      </w:r>
+      <w:r>
+        <w:rPr>
+          <w:rFonts w:ascii="Arial Narrow"/>
+          <w:sz w:val="20"/>
+        </w:rPr>
+        <w:t>Abbreviations: C</w:t>
+      </w:r>
+      <w:r>
+        <w:rPr>
+          <w:rFonts w:ascii="Arial Narrow"/>
+          <w:sz w:val="20"/>
+          <w:vertAlign w:val="subscript"/>
+        </w:rPr>
+        <w:t>max</w:t>
+      </w:r>
+      <w:r>
+        <w:rPr>
+          <w:rFonts w:ascii="Arial Narrow"/>
+          <w:sz w:val="20"/>
+        </w:rPr>
+        <w:t>: peak (maximum) concentration. T</w:t>
+      </w:r>
+      <w:r>
+        <w:rPr>
+          <w:rFonts w:ascii="Arial Narrow"/>
+          <w:sz w:val="20"/>
+          <w:vertAlign w:val="subscript"/>
+        </w:rPr>
+        <w:t>max</w:t>
+      </w:r>
+      <w:r>
+        <w:rPr>
+          <w:rFonts w:ascii="Arial Narrow"/>
+          <w:sz w:val="20"/>
+        </w:rPr>
+        <w:t xml:space="preserve">: time of maximum concentration. </w:t>
+      </w:r>
+      <w:bookmarkEnd w:id="8"/>
     </w:p>
     <w:p/>
     <w:sectPr>

</xml_diff>